<commit_message>
Update research paper and presentation with real results, implementation section, and explainability findings
</commit_message>
<xml_diff>
--- a/EstimateX_Research_Paper_2 (1).docx
+++ b/EstimateX_Research_Paper_2 (1).docx
@@ -1327,7 +1327,7 @@
           <w:sz w:val="20"/>
           <w:szCs w:val="20"/>
         </w:rPr>
-        <w:t xml:space="preserve">F. Deployment (Planned)</w:t>
+        <w:t>F. Deployment</w:t>
       </w:r>
     </w:p>
     <w:p>
@@ -1341,7 +1341,7 @@
           <w:sz w:val="20"/>
           <w:szCs w:val="20"/>
         </w:rPr>
-        <w:t xml:space="preserve">Training and evaluation come first, deployment after. The current plan is a lightweight web app, Flask or Streamlit most likely, where a user types in a project's details and gets back an estimate along with whatever factors mattered most for that particular prediction.</w:t>
+        <w:t>Training and evaluation come first, deployment after. The deployment is a lightweight Flask web app, where a user types in a project's details and gets back an estimate along with whatever factors mattered most for that particular prediction (Section VI).</w:t>
       </w:r>
     </w:p>
     <w:p>
@@ -1449,7 +1449,7 @@
           <w:sz w:val="20"/>
           <w:szCs w:val="20"/>
         </w:rPr>
-        <w:t xml:space="preserve">V. EXPECTED OUTCOMES</w:t>
+        <w:t>V. RESULTS</w:t>
       </w:r>
     </w:p>
     <w:p>
@@ -1463,7 +1463,1525 @@
           <w:sz w:val="20"/>
           <w:szCs w:val="20"/>
         </w:rPr>
-        <w:t xml:space="preserve">EstimateX has not been trained yet, we are still at the data-preparation stage, so what follows is a forecast rather than a result. Based on how the reviewed studies played out, an ensemble method is the likeliest candidate to come out on top, and whichever model wins should beat a COCOMO-style baseline by a real margin, not just a rounding error. Alongside that, we expect a ranked breakdown of which project attributes are actually driving the estimate, since a planner gets more use out of that than a single unexplained number. And further down the line, once there is a working interface, someone should be able to type in a few project details and get an estimate back without touching any code or needing to understand what is happening underneath.</w:t>
+        <w:t>With training and evaluation complete, Random Forest is the strongest performer on both datasets. On COCOMO-NASA it produced the lowest error on every magnitude-based metric (MAE 219.8, RMSE 440.3) and the best combination of MMRE (0.770) and PRED(25) (42.1%) of the four models tested, comfortably ahead of XGBoost, SVR, and Linear Regression, the last of which was badly unstable on this dataset. On Desharnais, Linear Regression edged out Random Forest on raw MAE by a small margin (2402.2 versus 2434.1, about 1.3%), but Random Forest more than made up for that with a PRED(25) of 25.0% against Linear Regression's 6.3%, roughly four times as many predictions landing within 25% of the actual value, so it was selected as the better model there too once accuracy and consistency are weighed together rather than MAE alone. Table III lays out every metric for all four models on both datasets.</w:t>
+      </w:r>
+    </w:p>
+    <w:p>
+      <w:pPr>
+        <w:spacing w:before="100" w:after="60"/>
+        <w:jc w:val="center"/>
+      </w:pPr>
+      <w:r>
+        <w:rPr>
+          <w:rFonts w:ascii="Times New Roman" w:hAnsi="Times New Roman"/>
+          <w:b/>
+          <w:sz w:val="16"/>
+        </w:rPr>
+        <w:t>TABLE III. MODEL COMPARISON — TEST SET RESULTS</w:t>
+      </w:r>
+    </w:p>
+    <w:tbl>
+      <w:tblPr>
+        <w:tblW w:type="auto" w:w="0"/>
+        <w:tblLayout w:type="fixed"/>
+        <w:tblLook w:firstColumn="1" w:firstRow="1" w:lastColumn="0" w:lastRow="0" w:noHBand="0" w:noVBand="1" w:val="04A0"/>
+        <w:tblW w:type="dxa" w:w="4600"/>
+        <w:tblBorders>
+          <w:top w:val="single" w:sz="4" w:color="auto"/>
+          <w:left w:val="single" w:sz="4" w:color="auto"/>
+          <w:bottom w:val="single" w:sz="4" w:color="auto"/>
+          <w:right w:val="single" w:sz="4" w:color="auto"/>
+          <w:insideH w:val="single" w:sz="4" w:color="auto"/>
+          <w:insideV w:val="single" w:sz="4" w:color="auto"/>
+        </w:tblBorders>
+      </w:tblPr>
+      <w:tblGrid>
+        <w:gridCol w:w="900"/>
+        <w:gridCol w:w="900"/>
+        <w:gridCol w:w="600"/>
+        <w:gridCol w:w="600"/>
+        <w:gridCol w:w="750"/>
+        <w:gridCol w:w="850"/>
+      </w:tblGrid>
+      <w:tr>
+        <w:tc>
+          <w:tcPr>
+            <w:tcW w:type="dxa" w:w="900"/>
+            <w:tcMar>
+              <w:top w:type="dxa" w:w="60"/>
+              <w:left w:type="dxa" w:w="80"/>
+              <w:bottom w:type="dxa" w:w="60"/>
+              <w:right w:type="dxa" w:w="80"/>
+            </w:tcMar>
+            <w:vAlign w:val="center"/>
+            <w:shd w:val="clear" w:fill="D9D9D9"/>
+          </w:tcPr>
+          <w:p>
+            <w:pPr>
+              <w:jc w:val="left"/>
+            </w:pPr>
+            <w:r>
+              <w:rPr>
+                <w:rFonts w:ascii="Times New Roman" w:hAnsi="Times New Roman"/>
+                <w:b/>
+                <w:sz w:val="15"/>
+              </w:rPr>
+              <w:t>Dataset</w:t>
+            </w:r>
+          </w:p>
+        </w:tc>
+        <w:tc>
+          <w:tcPr>
+            <w:tcW w:type="dxa" w:w="900"/>
+            <w:tcMar>
+              <w:top w:type="dxa" w:w="60"/>
+              <w:left w:type="dxa" w:w="80"/>
+              <w:bottom w:type="dxa" w:w="60"/>
+              <w:right w:type="dxa" w:w="80"/>
+            </w:tcMar>
+            <w:vAlign w:val="center"/>
+            <w:shd w:val="clear" w:fill="D9D9D9"/>
+          </w:tcPr>
+          <w:p>
+            <w:pPr>
+              <w:jc w:val="left"/>
+            </w:pPr>
+            <w:r>
+              <w:rPr>
+                <w:rFonts w:ascii="Times New Roman" w:hAnsi="Times New Roman"/>
+                <w:b/>
+                <w:sz w:val="15"/>
+              </w:rPr>
+              <w:t>Model</w:t>
+            </w:r>
+          </w:p>
+        </w:tc>
+        <w:tc>
+          <w:tcPr>
+            <w:tcW w:type="dxa" w:w="600"/>
+            <w:tcMar>
+              <w:top w:type="dxa" w:w="60"/>
+              <w:left w:type="dxa" w:w="80"/>
+              <w:bottom w:type="dxa" w:w="60"/>
+              <w:right w:type="dxa" w:w="80"/>
+            </w:tcMar>
+            <w:vAlign w:val="center"/>
+            <w:shd w:val="clear" w:fill="D9D9D9"/>
+          </w:tcPr>
+          <w:p>
+            <w:pPr>
+              <w:jc w:val="left"/>
+            </w:pPr>
+            <w:r>
+              <w:rPr>
+                <w:rFonts w:ascii="Times New Roman" w:hAnsi="Times New Roman"/>
+                <w:b/>
+                <w:sz w:val="15"/>
+              </w:rPr>
+              <w:t>MAE</w:t>
+            </w:r>
+          </w:p>
+        </w:tc>
+        <w:tc>
+          <w:tcPr>
+            <w:tcW w:type="dxa" w:w="600"/>
+            <w:tcMar>
+              <w:top w:type="dxa" w:w="60"/>
+              <w:left w:type="dxa" w:w="80"/>
+              <w:bottom w:type="dxa" w:w="60"/>
+              <w:right w:type="dxa" w:w="80"/>
+            </w:tcMar>
+            <w:vAlign w:val="center"/>
+            <w:shd w:val="clear" w:fill="D9D9D9"/>
+          </w:tcPr>
+          <w:p>
+            <w:pPr>
+              <w:jc w:val="left"/>
+            </w:pPr>
+            <w:r>
+              <w:rPr>
+                <w:rFonts w:ascii="Times New Roman" w:hAnsi="Times New Roman"/>
+                <w:b/>
+                <w:sz w:val="15"/>
+              </w:rPr>
+              <w:t>RMSE</w:t>
+            </w:r>
+          </w:p>
+        </w:tc>
+        <w:tc>
+          <w:tcPr>
+            <w:tcW w:type="dxa" w:w="750"/>
+            <w:tcMar>
+              <w:top w:type="dxa" w:w="60"/>
+              <w:left w:type="dxa" w:w="80"/>
+              <w:bottom w:type="dxa" w:w="60"/>
+              <w:right w:type="dxa" w:w="80"/>
+            </w:tcMar>
+            <w:vAlign w:val="center"/>
+            <w:shd w:val="clear" w:fill="D9D9D9"/>
+          </w:tcPr>
+          <w:p>
+            <w:pPr>
+              <w:jc w:val="left"/>
+            </w:pPr>
+            <w:r>
+              <w:rPr>
+                <w:rFonts w:ascii="Times New Roman" w:hAnsi="Times New Roman"/>
+                <w:b/>
+                <w:sz w:val="15"/>
+              </w:rPr>
+              <w:t>MMRE</w:t>
+            </w:r>
+          </w:p>
+        </w:tc>
+        <w:tc>
+          <w:tcPr>
+            <w:tcW w:type="dxa" w:w="850"/>
+            <w:tcMar>
+              <w:top w:type="dxa" w:w="60"/>
+              <w:left w:type="dxa" w:w="80"/>
+              <w:bottom w:type="dxa" w:w="60"/>
+              <w:right w:type="dxa" w:w="80"/>
+            </w:tcMar>
+            <w:vAlign w:val="center"/>
+            <w:shd w:val="clear" w:fill="D9D9D9"/>
+          </w:tcPr>
+          <w:p>
+            <w:pPr>
+              <w:jc w:val="left"/>
+            </w:pPr>
+            <w:r>
+              <w:rPr>
+                <w:rFonts w:ascii="Times New Roman" w:hAnsi="Times New Roman"/>
+                <w:b/>
+                <w:sz w:val="15"/>
+              </w:rPr>
+              <w:t>PRED(25)</w:t>
+            </w:r>
+          </w:p>
+        </w:tc>
+      </w:tr>
+      <w:tr>
+        <w:tc>
+          <w:tcPr>
+            <w:tcW w:type="dxa" w:w="900"/>
+            <w:tcMar>
+              <w:top w:type="dxa" w:w="60"/>
+              <w:left w:type="dxa" w:w="80"/>
+              <w:bottom w:type="dxa" w:w="60"/>
+              <w:right w:type="dxa" w:w="80"/>
+            </w:tcMar>
+            <w:vAlign w:val="center"/>
+          </w:tcPr>
+          <w:p>
+            <w:pPr>
+              <w:jc w:val="left"/>
+            </w:pPr>
+            <w:r>
+              <w:rPr>
+                <w:rFonts w:ascii="Times New Roman" w:hAnsi="Times New Roman"/>
+                <w:b w:val="0"/>
+                <w:sz w:val="15"/>
+              </w:rPr>
+              <w:t>COCOMO-NASA</w:t>
+            </w:r>
+          </w:p>
+        </w:tc>
+        <w:tc>
+          <w:tcPr>
+            <w:tcW w:type="dxa" w:w="900"/>
+            <w:tcMar>
+              <w:top w:type="dxa" w:w="60"/>
+              <w:left w:type="dxa" w:w="80"/>
+              <w:bottom w:type="dxa" w:w="60"/>
+              <w:right w:type="dxa" w:w="80"/>
+            </w:tcMar>
+            <w:vAlign w:val="center"/>
+          </w:tcPr>
+          <w:p>
+            <w:pPr>
+              <w:jc w:val="left"/>
+            </w:pPr>
+            <w:r>
+              <w:rPr>
+                <w:rFonts w:ascii="Times New Roman" w:hAnsi="Times New Roman"/>
+                <w:b w:val="0"/>
+                <w:sz w:val="15"/>
+              </w:rPr>
+              <w:t>Random Forest</w:t>
+            </w:r>
+          </w:p>
+        </w:tc>
+        <w:tc>
+          <w:tcPr>
+            <w:tcW w:type="dxa" w:w="600"/>
+            <w:tcMar>
+              <w:top w:type="dxa" w:w="60"/>
+              <w:left w:type="dxa" w:w="80"/>
+              <w:bottom w:type="dxa" w:w="60"/>
+              <w:right w:type="dxa" w:w="80"/>
+            </w:tcMar>
+            <w:vAlign w:val="center"/>
+          </w:tcPr>
+          <w:p>
+            <w:pPr>
+              <w:jc w:val="left"/>
+            </w:pPr>
+            <w:r>
+              <w:rPr>
+                <w:rFonts w:ascii="Times New Roman" w:hAnsi="Times New Roman"/>
+                <w:b w:val="0"/>
+                <w:sz w:val="15"/>
+              </w:rPr>
+              <w:t>219.8</w:t>
+            </w:r>
+          </w:p>
+        </w:tc>
+        <w:tc>
+          <w:tcPr>
+            <w:tcW w:type="dxa" w:w="600"/>
+            <w:tcMar>
+              <w:top w:type="dxa" w:w="60"/>
+              <w:left w:type="dxa" w:w="80"/>
+              <w:bottom w:type="dxa" w:w="60"/>
+              <w:right w:type="dxa" w:w="80"/>
+            </w:tcMar>
+            <w:vAlign w:val="center"/>
+          </w:tcPr>
+          <w:p>
+            <w:pPr>
+              <w:jc w:val="left"/>
+            </w:pPr>
+            <w:r>
+              <w:rPr>
+                <w:rFonts w:ascii="Times New Roman" w:hAnsi="Times New Roman"/>
+                <w:b w:val="0"/>
+                <w:sz w:val="15"/>
+              </w:rPr>
+              <w:t>440.3</w:t>
+            </w:r>
+          </w:p>
+        </w:tc>
+        <w:tc>
+          <w:tcPr>
+            <w:tcW w:type="dxa" w:w="750"/>
+            <w:tcMar>
+              <w:top w:type="dxa" w:w="60"/>
+              <w:left w:type="dxa" w:w="80"/>
+              <w:bottom w:type="dxa" w:w="60"/>
+              <w:right w:type="dxa" w:w="80"/>
+            </w:tcMar>
+            <w:vAlign w:val="center"/>
+          </w:tcPr>
+          <w:p>
+            <w:pPr>
+              <w:jc w:val="left"/>
+            </w:pPr>
+            <w:r>
+              <w:rPr>
+                <w:rFonts w:ascii="Times New Roman" w:hAnsi="Times New Roman"/>
+                <w:b w:val="0"/>
+                <w:sz w:val="15"/>
+              </w:rPr>
+              <w:t>0.770</w:t>
+            </w:r>
+          </w:p>
+        </w:tc>
+        <w:tc>
+          <w:tcPr>
+            <w:tcW w:type="dxa" w:w="850"/>
+            <w:tcMar>
+              <w:top w:type="dxa" w:w="60"/>
+              <w:left w:type="dxa" w:w="80"/>
+              <w:bottom w:type="dxa" w:w="60"/>
+              <w:right w:type="dxa" w:w="80"/>
+            </w:tcMar>
+            <w:vAlign w:val="center"/>
+          </w:tcPr>
+          <w:p>
+            <w:pPr>
+              <w:jc w:val="left"/>
+            </w:pPr>
+            <w:r>
+              <w:rPr>
+                <w:rFonts w:ascii="Times New Roman" w:hAnsi="Times New Roman"/>
+                <w:b w:val="0"/>
+                <w:sz w:val="15"/>
+              </w:rPr>
+              <w:t>42.1%</w:t>
+            </w:r>
+          </w:p>
+        </w:tc>
+      </w:tr>
+      <w:tr>
+        <w:tc>
+          <w:tcPr>
+            <w:tcW w:type="dxa" w:w="900"/>
+            <w:tcMar>
+              <w:top w:type="dxa" w:w="60"/>
+              <w:left w:type="dxa" w:w="80"/>
+              <w:bottom w:type="dxa" w:w="60"/>
+              <w:right w:type="dxa" w:w="80"/>
+            </w:tcMar>
+            <w:vAlign w:val="center"/>
+          </w:tcPr>
+          <w:p>
+            <w:pPr>
+              <w:jc w:val="left"/>
+            </w:pPr>
+            <w:r>
+              <w:rPr>
+                <w:rFonts w:ascii="Times New Roman" w:hAnsi="Times New Roman"/>
+                <w:b w:val="0"/>
+                <w:sz w:val="15"/>
+              </w:rPr>
+              <w:t>COCOMO-NASA</w:t>
+            </w:r>
+          </w:p>
+        </w:tc>
+        <w:tc>
+          <w:tcPr>
+            <w:tcW w:type="dxa" w:w="900"/>
+            <w:tcMar>
+              <w:top w:type="dxa" w:w="60"/>
+              <w:left w:type="dxa" w:w="80"/>
+              <w:bottom w:type="dxa" w:w="60"/>
+              <w:right w:type="dxa" w:w="80"/>
+            </w:tcMar>
+            <w:vAlign w:val="center"/>
+          </w:tcPr>
+          <w:p>
+            <w:pPr>
+              <w:jc w:val="left"/>
+            </w:pPr>
+            <w:r>
+              <w:rPr>
+                <w:rFonts w:ascii="Times New Roman" w:hAnsi="Times New Roman"/>
+                <w:b w:val="0"/>
+                <w:sz w:val="15"/>
+              </w:rPr>
+              <w:t>XGBoost</w:t>
+            </w:r>
+          </w:p>
+        </w:tc>
+        <w:tc>
+          <w:tcPr>
+            <w:tcW w:type="dxa" w:w="600"/>
+            <w:tcMar>
+              <w:top w:type="dxa" w:w="60"/>
+              <w:left w:type="dxa" w:w="80"/>
+              <w:bottom w:type="dxa" w:w="60"/>
+              <w:right w:type="dxa" w:w="80"/>
+            </w:tcMar>
+            <w:vAlign w:val="center"/>
+          </w:tcPr>
+          <w:p>
+            <w:pPr>
+              <w:jc w:val="left"/>
+            </w:pPr>
+            <w:r>
+              <w:rPr>
+                <w:rFonts w:ascii="Times New Roman" w:hAnsi="Times New Roman"/>
+                <w:b w:val="0"/>
+                <w:sz w:val="15"/>
+              </w:rPr>
+              <w:t>225.7</w:t>
+            </w:r>
+          </w:p>
+        </w:tc>
+        <w:tc>
+          <w:tcPr>
+            <w:tcW w:type="dxa" w:w="600"/>
+            <w:tcMar>
+              <w:top w:type="dxa" w:w="60"/>
+              <w:left w:type="dxa" w:w="80"/>
+              <w:bottom w:type="dxa" w:w="60"/>
+              <w:right w:type="dxa" w:w="80"/>
+            </w:tcMar>
+            <w:vAlign w:val="center"/>
+          </w:tcPr>
+          <w:p>
+            <w:pPr>
+              <w:jc w:val="left"/>
+            </w:pPr>
+            <w:r>
+              <w:rPr>
+                <w:rFonts w:ascii="Times New Roman" w:hAnsi="Times New Roman"/>
+                <w:b w:val="0"/>
+                <w:sz w:val="15"/>
+              </w:rPr>
+              <w:t>426.4</w:t>
+            </w:r>
+          </w:p>
+        </w:tc>
+        <w:tc>
+          <w:tcPr>
+            <w:tcW w:type="dxa" w:w="750"/>
+            <w:tcMar>
+              <w:top w:type="dxa" w:w="60"/>
+              <w:left w:type="dxa" w:w="80"/>
+              <w:bottom w:type="dxa" w:w="60"/>
+              <w:right w:type="dxa" w:w="80"/>
+            </w:tcMar>
+            <w:vAlign w:val="center"/>
+          </w:tcPr>
+          <w:p>
+            <w:pPr>
+              <w:jc w:val="left"/>
+            </w:pPr>
+            <w:r>
+              <w:rPr>
+                <w:rFonts w:ascii="Times New Roman" w:hAnsi="Times New Roman"/>
+                <w:b w:val="0"/>
+                <w:sz w:val="15"/>
+              </w:rPr>
+              <w:t>0.790</w:t>
+            </w:r>
+          </w:p>
+        </w:tc>
+        <w:tc>
+          <w:tcPr>
+            <w:tcW w:type="dxa" w:w="850"/>
+            <w:tcMar>
+              <w:top w:type="dxa" w:w="60"/>
+              <w:left w:type="dxa" w:w="80"/>
+              <w:bottom w:type="dxa" w:w="60"/>
+              <w:right w:type="dxa" w:w="80"/>
+            </w:tcMar>
+            <w:vAlign w:val="center"/>
+          </w:tcPr>
+          <w:p>
+            <w:pPr>
+              <w:jc w:val="left"/>
+            </w:pPr>
+            <w:r>
+              <w:rPr>
+                <w:rFonts w:ascii="Times New Roman" w:hAnsi="Times New Roman"/>
+                <w:b w:val="0"/>
+                <w:sz w:val="15"/>
+              </w:rPr>
+              <w:t>26.3%</w:t>
+            </w:r>
+          </w:p>
+        </w:tc>
+      </w:tr>
+      <w:tr>
+        <w:tc>
+          <w:tcPr>
+            <w:tcW w:type="dxa" w:w="900"/>
+            <w:tcMar>
+              <w:top w:type="dxa" w:w="60"/>
+              <w:left w:type="dxa" w:w="80"/>
+              <w:bottom w:type="dxa" w:w="60"/>
+              <w:right w:type="dxa" w:w="80"/>
+            </w:tcMar>
+            <w:vAlign w:val="center"/>
+          </w:tcPr>
+          <w:p>
+            <w:pPr>
+              <w:jc w:val="left"/>
+            </w:pPr>
+            <w:r>
+              <w:rPr>
+                <w:rFonts w:ascii="Times New Roman" w:hAnsi="Times New Roman"/>
+                <w:b w:val="0"/>
+                <w:sz w:val="15"/>
+              </w:rPr>
+              <w:t>COCOMO-NASA</w:t>
+            </w:r>
+          </w:p>
+        </w:tc>
+        <w:tc>
+          <w:tcPr>
+            <w:tcW w:type="dxa" w:w="900"/>
+            <w:tcMar>
+              <w:top w:type="dxa" w:w="60"/>
+              <w:left w:type="dxa" w:w="80"/>
+              <w:bottom w:type="dxa" w:w="60"/>
+              <w:right w:type="dxa" w:w="80"/>
+            </w:tcMar>
+            <w:vAlign w:val="center"/>
+          </w:tcPr>
+          <w:p>
+            <w:pPr>
+              <w:jc w:val="left"/>
+            </w:pPr>
+            <w:r>
+              <w:rPr>
+                <w:rFonts w:ascii="Times New Roman" w:hAnsi="Times New Roman"/>
+                <w:b w:val="0"/>
+                <w:sz w:val="15"/>
+              </w:rPr>
+              <w:t>SVR</w:t>
+            </w:r>
+          </w:p>
+        </w:tc>
+        <w:tc>
+          <w:tcPr>
+            <w:tcW w:type="dxa" w:w="600"/>
+            <w:tcMar>
+              <w:top w:type="dxa" w:w="60"/>
+              <w:left w:type="dxa" w:w="80"/>
+              <w:bottom w:type="dxa" w:w="60"/>
+              <w:right w:type="dxa" w:w="80"/>
+            </w:tcMar>
+            <w:vAlign w:val="center"/>
+          </w:tcPr>
+          <w:p>
+            <w:pPr>
+              <w:jc w:val="left"/>
+            </w:pPr>
+            <w:r>
+              <w:rPr>
+                <w:rFonts w:ascii="Times New Roman" w:hAnsi="Times New Roman"/>
+                <w:b w:val="0"/>
+                <w:sz w:val="15"/>
+              </w:rPr>
+              <w:t>266.2</w:t>
+            </w:r>
+          </w:p>
+        </w:tc>
+        <w:tc>
+          <w:tcPr>
+            <w:tcW w:type="dxa" w:w="600"/>
+            <w:tcMar>
+              <w:top w:type="dxa" w:w="60"/>
+              <w:left w:type="dxa" w:w="80"/>
+              <w:bottom w:type="dxa" w:w="60"/>
+              <w:right w:type="dxa" w:w="80"/>
+            </w:tcMar>
+            <w:vAlign w:val="center"/>
+          </w:tcPr>
+          <w:p>
+            <w:pPr>
+              <w:jc w:val="left"/>
+            </w:pPr>
+            <w:r>
+              <w:rPr>
+                <w:rFonts w:ascii="Times New Roman" w:hAnsi="Times New Roman"/>
+                <w:b w:val="0"/>
+                <w:sz w:val="15"/>
+              </w:rPr>
+              <w:t>353.3</w:t>
+            </w:r>
+          </w:p>
+        </w:tc>
+        <w:tc>
+          <w:tcPr>
+            <w:tcW w:type="dxa" w:w="750"/>
+            <w:tcMar>
+              <w:top w:type="dxa" w:w="60"/>
+              <w:left w:type="dxa" w:w="80"/>
+              <w:bottom w:type="dxa" w:w="60"/>
+              <w:right w:type="dxa" w:w="80"/>
+            </w:tcMar>
+            <w:vAlign w:val="center"/>
+          </w:tcPr>
+          <w:p>
+            <w:pPr>
+              <w:jc w:val="left"/>
+            </w:pPr>
+            <w:r>
+              <w:rPr>
+                <w:rFonts w:ascii="Times New Roman" w:hAnsi="Times New Roman"/>
+                <w:b w:val="0"/>
+                <w:sz w:val="15"/>
+              </w:rPr>
+              <w:t>2.941</w:t>
+            </w:r>
+          </w:p>
+        </w:tc>
+        <w:tc>
+          <w:tcPr>
+            <w:tcW w:type="dxa" w:w="850"/>
+            <w:tcMar>
+              <w:top w:type="dxa" w:w="60"/>
+              <w:left w:type="dxa" w:w="80"/>
+              <w:bottom w:type="dxa" w:w="60"/>
+              <w:right w:type="dxa" w:w="80"/>
+            </w:tcMar>
+            <w:vAlign w:val="center"/>
+          </w:tcPr>
+          <w:p>
+            <w:pPr>
+              <w:jc w:val="left"/>
+            </w:pPr>
+            <w:r>
+              <w:rPr>
+                <w:rFonts w:ascii="Times New Roman" w:hAnsi="Times New Roman"/>
+                <w:b w:val="0"/>
+                <w:sz w:val="15"/>
+              </w:rPr>
+              <w:t>10.5%</w:t>
+            </w:r>
+          </w:p>
+        </w:tc>
+      </w:tr>
+      <w:tr>
+        <w:tc>
+          <w:tcPr>
+            <w:tcW w:type="dxa" w:w="900"/>
+            <w:tcMar>
+              <w:top w:type="dxa" w:w="60"/>
+              <w:left w:type="dxa" w:w="80"/>
+              <w:bottom w:type="dxa" w:w="60"/>
+              <w:right w:type="dxa" w:w="80"/>
+            </w:tcMar>
+            <w:vAlign w:val="center"/>
+          </w:tcPr>
+          <w:p>
+            <w:pPr>
+              <w:jc w:val="left"/>
+            </w:pPr>
+            <w:r>
+              <w:rPr>
+                <w:rFonts w:ascii="Times New Roman" w:hAnsi="Times New Roman"/>
+                <w:b w:val="0"/>
+                <w:sz w:val="15"/>
+              </w:rPr>
+              <w:t>COCOMO-NASA</w:t>
+            </w:r>
+          </w:p>
+        </w:tc>
+        <w:tc>
+          <w:tcPr>
+            <w:tcW w:type="dxa" w:w="900"/>
+            <w:tcMar>
+              <w:top w:type="dxa" w:w="60"/>
+              <w:left w:type="dxa" w:w="80"/>
+              <w:bottom w:type="dxa" w:w="60"/>
+              <w:right w:type="dxa" w:w="80"/>
+            </w:tcMar>
+            <w:vAlign w:val="center"/>
+          </w:tcPr>
+          <w:p>
+            <w:pPr>
+              <w:jc w:val="left"/>
+            </w:pPr>
+            <w:r>
+              <w:rPr>
+                <w:rFonts w:ascii="Times New Roman" w:hAnsi="Times New Roman"/>
+                <w:b w:val="0"/>
+                <w:sz w:val="15"/>
+              </w:rPr>
+              <w:t>Linear Regression</w:t>
+            </w:r>
+          </w:p>
+        </w:tc>
+        <w:tc>
+          <w:tcPr>
+            <w:tcW w:type="dxa" w:w="600"/>
+            <w:tcMar>
+              <w:top w:type="dxa" w:w="60"/>
+              <w:left w:type="dxa" w:w="80"/>
+              <w:bottom w:type="dxa" w:w="60"/>
+              <w:right w:type="dxa" w:w="80"/>
+            </w:tcMar>
+            <w:vAlign w:val="center"/>
+          </w:tcPr>
+          <w:p>
+            <w:pPr>
+              <w:jc w:val="left"/>
+            </w:pPr>
+            <w:r>
+              <w:rPr>
+                <w:rFonts w:ascii="Times New Roman" w:hAnsi="Times New Roman"/>
+                <w:b w:val="0"/>
+                <w:sz w:val="15"/>
+              </w:rPr>
+              <w:t>692.2</w:t>
+            </w:r>
+          </w:p>
+        </w:tc>
+        <w:tc>
+          <w:tcPr>
+            <w:tcW w:type="dxa" w:w="600"/>
+            <w:tcMar>
+              <w:top w:type="dxa" w:w="60"/>
+              <w:left w:type="dxa" w:w="80"/>
+              <w:bottom w:type="dxa" w:w="60"/>
+              <w:right w:type="dxa" w:w="80"/>
+            </w:tcMar>
+            <w:vAlign w:val="center"/>
+          </w:tcPr>
+          <w:p>
+            <w:pPr>
+              <w:jc w:val="left"/>
+            </w:pPr>
+            <w:r>
+              <w:rPr>
+                <w:rFonts w:ascii="Times New Roman" w:hAnsi="Times New Roman"/>
+                <w:b w:val="0"/>
+                <w:sz w:val="15"/>
+              </w:rPr>
+              <w:t>1173.0</w:t>
+            </w:r>
+          </w:p>
+        </w:tc>
+        <w:tc>
+          <w:tcPr>
+            <w:tcW w:type="dxa" w:w="750"/>
+            <w:tcMar>
+              <w:top w:type="dxa" w:w="60"/>
+              <w:left w:type="dxa" w:w="80"/>
+              <w:bottom w:type="dxa" w:w="60"/>
+              <w:right w:type="dxa" w:w="80"/>
+            </w:tcMar>
+            <w:vAlign w:val="center"/>
+          </w:tcPr>
+          <w:p>
+            <w:pPr>
+              <w:jc w:val="left"/>
+            </w:pPr>
+            <w:r>
+              <w:rPr>
+                <w:rFonts w:ascii="Times New Roman" w:hAnsi="Times New Roman"/>
+                <w:b w:val="0"/>
+                <w:sz w:val="15"/>
+              </w:rPr>
+              <w:t>4.576</w:t>
+            </w:r>
+          </w:p>
+        </w:tc>
+        <w:tc>
+          <w:tcPr>
+            <w:tcW w:type="dxa" w:w="850"/>
+            <w:tcMar>
+              <w:top w:type="dxa" w:w="60"/>
+              <w:left w:type="dxa" w:w="80"/>
+              <w:bottom w:type="dxa" w:w="60"/>
+              <w:right w:type="dxa" w:w="80"/>
+            </w:tcMar>
+            <w:vAlign w:val="center"/>
+          </w:tcPr>
+          <w:p>
+            <w:pPr>
+              <w:jc w:val="left"/>
+            </w:pPr>
+            <w:r>
+              <w:rPr>
+                <w:rFonts w:ascii="Times New Roman" w:hAnsi="Times New Roman"/>
+                <w:b w:val="0"/>
+                <w:sz w:val="15"/>
+              </w:rPr>
+              <w:t>10.5%</w:t>
+            </w:r>
+          </w:p>
+        </w:tc>
+      </w:tr>
+      <w:tr>
+        <w:tc>
+          <w:tcPr>
+            <w:tcW w:type="dxa" w:w="900"/>
+            <w:tcMar>
+              <w:top w:type="dxa" w:w="60"/>
+              <w:left w:type="dxa" w:w="80"/>
+              <w:bottom w:type="dxa" w:w="60"/>
+              <w:right w:type="dxa" w:w="80"/>
+            </w:tcMar>
+            <w:vAlign w:val="center"/>
+          </w:tcPr>
+          <w:p>
+            <w:pPr>
+              <w:jc w:val="left"/>
+            </w:pPr>
+            <w:r>
+              <w:rPr>
+                <w:rFonts w:ascii="Times New Roman" w:hAnsi="Times New Roman"/>
+                <w:b w:val="0"/>
+                <w:sz w:val="15"/>
+              </w:rPr>
+              <w:t>Desharnais</w:t>
+            </w:r>
+          </w:p>
+        </w:tc>
+        <w:tc>
+          <w:tcPr>
+            <w:tcW w:type="dxa" w:w="900"/>
+            <w:tcMar>
+              <w:top w:type="dxa" w:w="60"/>
+              <w:left w:type="dxa" w:w="80"/>
+              <w:bottom w:type="dxa" w:w="60"/>
+              <w:right w:type="dxa" w:w="80"/>
+            </w:tcMar>
+            <w:vAlign w:val="center"/>
+          </w:tcPr>
+          <w:p>
+            <w:pPr>
+              <w:jc w:val="left"/>
+            </w:pPr>
+            <w:r>
+              <w:rPr>
+                <w:rFonts w:ascii="Times New Roman" w:hAnsi="Times New Roman"/>
+                <w:b w:val="0"/>
+                <w:sz w:val="15"/>
+              </w:rPr>
+              <w:t>Linear Regression</w:t>
+            </w:r>
+          </w:p>
+        </w:tc>
+        <w:tc>
+          <w:tcPr>
+            <w:tcW w:type="dxa" w:w="600"/>
+            <w:tcMar>
+              <w:top w:type="dxa" w:w="60"/>
+              <w:left w:type="dxa" w:w="80"/>
+              <w:bottom w:type="dxa" w:w="60"/>
+              <w:right w:type="dxa" w:w="80"/>
+            </w:tcMar>
+            <w:vAlign w:val="center"/>
+          </w:tcPr>
+          <w:p>
+            <w:pPr>
+              <w:jc w:val="left"/>
+            </w:pPr>
+            <w:r>
+              <w:rPr>
+                <w:rFonts w:ascii="Times New Roman" w:hAnsi="Times New Roman"/>
+                <w:b w:val="0"/>
+                <w:sz w:val="15"/>
+              </w:rPr>
+              <w:t>2402.2</w:t>
+            </w:r>
+          </w:p>
+        </w:tc>
+        <w:tc>
+          <w:tcPr>
+            <w:tcW w:type="dxa" w:w="600"/>
+            <w:tcMar>
+              <w:top w:type="dxa" w:w="60"/>
+              <w:left w:type="dxa" w:w="80"/>
+              <w:bottom w:type="dxa" w:w="60"/>
+              <w:right w:type="dxa" w:w="80"/>
+            </w:tcMar>
+            <w:vAlign w:val="center"/>
+          </w:tcPr>
+          <w:p>
+            <w:pPr>
+              <w:jc w:val="left"/>
+            </w:pPr>
+            <w:r>
+              <w:rPr>
+                <w:rFonts w:ascii="Times New Roman" w:hAnsi="Times New Roman"/>
+                <w:b w:val="0"/>
+                <w:sz w:val="15"/>
+              </w:rPr>
+              <w:t>3075.3</w:t>
+            </w:r>
+          </w:p>
+        </w:tc>
+        <w:tc>
+          <w:tcPr>
+            <w:tcW w:type="dxa" w:w="750"/>
+            <w:tcMar>
+              <w:top w:type="dxa" w:w="60"/>
+              <w:left w:type="dxa" w:w="80"/>
+              <w:bottom w:type="dxa" w:w="60"/>
+              <w:right w:type="dxa" w:w="80"/>
+            </w:tcMar>
+            <w:vAlign w:val="center"/>
+          </w:tcPr>
+          <w:p>
+            <w:pPr>
+              <w:jc w:val="left"/>
+            </w:pPr>
+            <w:r>
+              <w:rPr>
+                <w:rFonts w:ascii="Times New Roman" w:hAnsi="Times New Roman"/>
+                <w:b w:val="0"/>
+                <w:sz w:val="15"/>
+              </w:rPr>
+              <w:t>0.446</w:t>
+            </w:r>
+          </w:p>
+        </w:tc>
+        <w:tc>
+          <w:tcPr>
+            <w:tcW w:type="dxa" w:w="850"/>
+            <w:tcMar>
+              <w:top w:type="dxa" w:w="60"/>
+              <w:left w:type="dxa" w:w="80"/>
+              <w:bottom w:type="dxa" w:w="60"/>
+              <w:right w:type="dxa" w:w="80"/>
+            </w:tcMar>
+            <w:vAlign w:val="center"/>
+          </w:tcPr>
+          <w:p>
+            <w:pPr>
+              <w:jc w:val="left"/>
+            </w:pPr>
+            <w:r>
+              <w:rPr>
+                <w:rFonts w:ascii="Times New Roman" w:hAnsi="Times New Roman"/>
+                <w:b w:val="0"/>
+                <w:sz w:val="15"/>
+              </w:rPr>
+              <w:t>6.3%</w:t>
+            </w:r>
+          </w:p>
+        </w:tc>
+      </w:tr>
+      <w:tr>
+        <w:tc>
+          <w:tcPr>
+            <w:tcW w:type="dxa" w:w="900"/>
+            <w:tcMar>
+              <w:top w:type="dxa" w:w="60"/>
+              <w:left w:type="dxa" w:w="80"/>
+              <w:bottom w:type="dxa" w:w="60"/>
+              <w:right w:type="dxa" w:w="80"/>
+            </w:tcMar>
+            <w:vAlign w:val="center"/>
+          </w:tcPr>
+          <w:p>
+            <w:pPr>
+              <w:jc w:val="left"/>
+            </w:pPr>
+            <w:r>
+              <w:rPr>
+                <w:rFonts w:ascii="Times New Roman" w:hAnsi="Times New Roman"/>
+                <w:b w:val="0"/>
+                <w:sz w:val="15"/>
+              </w:rPr>
+              <w:t>Desharnais</w:t>
+            </w:r>
+          </w:p>
+        </w:tc>
+        <w:tc>
+          <w:tcPr>
+            <w:tcW w:type="dxa" w:w="900"/>
+            <w:tcMar>
+              <w:top w:type="dxa" w:w="60"/>
+              <w:left w:type="dxa" w:w="80"/>
+              <w:bottom w:type="dxa" w:w="60"/>
+              <w:right w:type="dxa" w:w="80"/>
+            </w:tcMar>
+            <w:vAlign w:val="center"/>
+          </w:tcPr>
+          <w:p>
+            <w:pPr>
+              <w:jc w:val="left"/>
+            </w:pPr>
+            <w:r>
+              <w:rPr>
+                <w:rFonts w:ascii="Times New Roman" w:hAnsi="Times New Roman"/>
+                <w:b w:val="0"/>
+                <w:sz w:val="15"/>
+              </w:rPr>
+              <w:t>Random Forest</w:t>
+            </w:r>
+          </w:p>
+        </w:tc>
+        <w:tc>
+          <w:tcPr>
+            <w:tcW w:type="dxa" w:w="600"/>
+            <w:tcMar>
+              <w:top w:type="dxa" w:w="60"/>
+              <w:left w:type="dxa" w:w="80"/>
+              <w:bottom w:type="dxa" w:w="60"/>
+              <w:right w:type="dxa" w:w="80"/>
+            </w:tcMar>
+            <w:vAlign w:val="center"/>
+          </w:tcPr>
+          <w:p>
+            <w:pPr>
+              <w:jc w:val="left"/>
+            </w:pPr>
+            <w:r>
+              <w:rPr>
+                <w:rFonts w:ascii="Times New Roman" w:hAnsi="Times New Roman"/>
+                <w:b w:val="0"/>
+                <w:sz w:val="15"/>
+              </w:rPr>
+              <w:t>2434.1</w:t>
+            </w:r>
+          </w:p>
+        </w:tc>
+        <w:tc>
+          <w:tcPr>
+            <w:tcW w:type="dxa" w:w="600"/>
+            <w:tcMar>
+              <w:top w:type="dxa" w:w="60"/>
+              <w:left w:type="dxa" w:w="80"/>
+              <w:bottom w:type="dxa" w:w="60"/>
+              <w:right w:type="dxa" w:w="80"/>
+            </w:tcMar>
+            <w:vAlign w:val="center"/>
+          </w:tcPr>
+          <w:p>
+            <w:pPr>
+              <w:jc w:val="left"/>
+            </w:pPr>
+            <w:r>
+              <w:rPr>
+                <w:rFonts w:ascii="Times New Roman" w:hAnsi="Times New Roman"/>
+                <w:b w:val="0"/>
+                <w:sz w:val="15"/>
+              </w:rPr>
+              <w:t>3343.4</w:t>
+            </w:r>
+          </w:p>
+        </w:tc>
+        <w:tc>
+          <w:tcPr>
+            <w:tcW w:type="dxa" w:w="750"/>
+            <w:tcMar>
+              <w:top w:type="dxa" w:w="60"/>
+              <w:left w:type="dxa" w:w="80"/>
+              <w:bottom w:type="dxa" w:w="60"/>
+              <w:right w:type="dxa" w:w="80"/>
+            </w:tcMar>
+            <w:vAlign w:val="center"/>
+          </w:tcPr>
+          <w:p>
+            <w:pPr>
+              <w:jc w:val="left"/>
+            </w:pPr>
+            <w:r>
+              <w:rPr>
+                <w:rFonts w:ascii="Times New Roman" w:hAnsi="Times New Roman"/>
+                <w:b w:val="0"/>
+                <w:sz w:val="15"/>
+              </w:rPr>
+              <w:t>0.414</w:t>
+            </w:r>
+          </w:p>
+        </w:tc>
+        <w:tc>
+          <w:tcPr>
+            <w:tcW w:type="dxa" w:w="850"/>
+            <w:tcMar>
+              <w:top w:type="dxa" w:w="60"/>
+              <w:left w:type="dxa" w:w="80"/>
+              <w:bottom w:type="dxa" w:w="60"/>
+              <w:right w:type="dxa" w:w="80"/>
+            </w:tcMar>
+            <w:vAlign w:val="center"/>
+          </w:tcPr>
+          <w:p>
+            <w:pPr>
+              <w:jc w:val="left"/>
+            </w:pPr>
+            <w:r>
+              <w:rPr>
+                <w:rFonts w:ascii="Times New Roman" w:hAnsi="Times New Roman"/>
+                <w:b w:val="0"/>
+                <w:sz w:val="15"/>
+              </w:rPr>
+              <w:t>25.0%</w:t>
+            </w:r>
+          </w:p>
+        </w:tc>
+      </w:tr>
+      <w:tr>
+        <w:tc>
+          <w:tcPr>
+            <w:tcW w:type="dxa" w:w="900"/>
+            <w:tcMar>
+              <w:top w:type="dxa" w:w="60"/>
+              <w:left w:type="dxa" w:w="80"/>
+              <w:bottom w:type="dxa" w:w="60"/>
+              <w:right w:type="dxa" w:w="80"/>
+            </w:tcMar>
+            <w:vAlign w:val="center"/>
+          </w:tcPr>
+          <w:p>
+            <w:pPr>
+              <w:jc w:val="left"/>
+            </w:pPr>
+            <w:r>
+              <w:rPr>
+                <w:rFonts w:ascii="Times New Roman" w:hAnsi="Times New Roman"/>
+                <w:b w:val="0"/>
+                <w:sz w:val="15"/>
+              </w:rPr>
+              <w:t>Desharnais</w:t>
+            </w:r>
+          </w:p>
+        </w:tc>
+        <w:tc>
+          <w:tcPr>
+            <w:tcW w:type="dxa" w:w="900"/>
+            <w:tcMar>
+              <w:top w:type="dxa" w:w="60"/>
+              <w:left w:type="dxa" w:w="80"/>
+              <w:bottom w:type="dxa" w:w="60"/>
+              <w:right w:type="dxa" w:w="80"/>
+            </w:tcMar>
+            <w:vAlign w:val="center"/>
+          </w:tcPr>
+          <w:p>
+            <w:pPr>
+              <w:jc w:val="left"/>
+            </w:pPr>
+            <w:r>
+              <w:rPr>
+                <w:rFonts w:ascii="Times New Roman" w:hAnsi="Times New Roman"/>
+                <w:b w:val="0"/>
+                <w:sz w:val="15"/>
+              </w:rPr>
+              <w:t>XGBoost</w:t>
+            </w:r>
+          </w:p>
+        </w:tc>
+        <w:tc>
+          <w:tcPr>
+            <w:tcW w:type="dxa" w:w="600"/>
+            <w:tcMar>
+              <w:top w:type="dxa" w:w="60"/>
+              <w:left w:type="dxa" w:w="80"/>
+              <w:bottom w:type="dxa" w:w="60"/>
+              <w:right w:type="dxa" w:w="80"/>
+            </w:tcMar>
+            <w:vAlign w:val="center"/>
+          </w:tcPr>
+          <w:p>
+            <w:pPr>
+              <w:jc w:val="left"/>
+            </w:pPr>
+            <w:r>
+              <w:rPr>
+                <w:rFonts w:ascii="Times New Roman" w:hAnsi="Times New Roman"/>
+                <w:b w:val="0"/>
+                <w:sz w:val="15"/>
+              </w:rPr>
+              <w:t>2976.8</w:t>
+            </w:r>
+          </w:p>
+        </w:tc>
+        <w:tc>
+          <w:tcPr>
+            <w:tcW w:type="dxa" w:w="600"/>
+            <w:tcMar>
+              <w:top w:type="dxa" w:w="60"/>
+              <w:left w:type="dxa" w:w="80"/>
+              <w:bottom w:type="dxa" w:w="60"/>
+              <w:right w:type="dxa" w:w="80"/>
+            </w:tcMar>
+            <w:vAlign w:val="center"/>
+          </w:tcPr>
+          <w:p>
+            <w:pPr>
+              <w:jc w:val="left"/>
+            </w:pPr>
+            <w:r>
+              <w:rPr>
+                <w:rFonts w:ascii="Times New Roman" w:hAnsi="Times New Roman"/>
+                <w:b w:val="0"/>
+                <w:sz w:val="15"/>
+              </w:rPr>
+              <w:t>3957.4</w:t>
+            </w:r>
+          </w:p>
+        </w:tc>
+        <w:tc>
+          <w:tcPr>
+            <w:tcW w:type="dxa" w:w="750"/>
+            <w:tcMar>
+              <w:top w:type="dxa" w:w="60"/>
+              <w:left w:type="dxa" w:w="80"/>
+              <w:bottom w:type="dxa" w:w="60"/>
+              <w:right w:type="dxa" w:w="80"/>
+            </w:tcMar>
+            <w:vAlign w:val="center"/>
+          </w:tcPr>
+          <w:p>
+            <w:pPr>
+              <w:jc w:val="left"/>
+            </w:pPr>
+            <w:r>
+              <w:rPr>
+                <w:rFonts w:ascii="Times New Roman" w:hAnsi="Times New Roman"/>
+                <w:b w:val="0"/>
+                <w:sz w:val="15"/>
+              </w:rPr>
+              <w:t>0.503</w:t>
+            </w:r>
+          </w:p>
+        </w:tc>
+        <w:tc>
+          <w:tcPr>
+            <w:tcW w:type="dxa" w:w="850"/>
+            <w:tcMar>
+              <w:top w:type="dxa" w:w="60"/>
+              <w:left w:type="dxa" w:w="80"/>
+              <w:bottom w:type="dxa" w:w="60"/>
+              <w:right w:type="dxa" w:w="80"/>
+            </w:tcMar>
+            <w:vAlign w:val="center"/>
+          </w:tcPr>
+          <w:p>
+            <w:pPr>
+              <w:jc w:val="left"/>
+            </w:pPr>
+            <w:r>
+              <w:rPr>
+                <w:rFonts w:ascii="Times New Roman" w:hAnsi="Times New Roman"/>
+                <w:b w:val="0"/>
+                <w:sz w:val="15"/>
+              </w:rPr>
+              <w:t>12.5%</w:t>
+            </w:r>
+          </w:p>
+        </w:tc>
+      </w:tr>
+      <w:tr>
+        <w:tc>
+          <w:tcPr>
+            <w:tcW w:type="dxa" w:w="900"/>
+            <w:tcMar>
+              <w:top w:type="dxa" w:w="60"/>
+              <w:left w:type="dxa" w:w="80"/>
+              <w:bottom w:type="dxa" w:w="60"/>
+              <w:right w:type="dxa" w:w="80"/>
+            </w:tcMar>
+            <w:vAlign w:val="center"/>
+          </w:tcPr>
+          <w:p>
+            <w:pPr>
+              <w:jc w:val="left"/>
+            </w:pPr>
+            <w:r>
+              <w:rPr>
+                <w:rFonts w:ascii="Times New Roman" w:hAnsi="Times New Roman"/>
+                <w:b w:val="0"/>
+                <w:sz w:val="15"/>
+              </w:rPr>
+              <w:t>Desharnais</w:t>
+            </w:r>
+          </w:p>
+        </w:tc>
+        <w:tc>
+          <w:tcPr>
+            <w:tcW w:type="dxa" w:w="900"/>
+            <w:tcMar>
+              <w:top w:type="dxa" w:w="60"/>
+              <w:left w:type="dxa" w:w="80"/>
+              <w:bottom w:type="dxa" w:w="60"/>
+              <w:right w:type="dxa" w:w="80"/>
+            </w:tcMar>
+            <w:vAlign w:val="center"/>
+          </w:tcPr>
+          <w:p>
+            <w:pPr>
+              <w:jc w:val="left"/>
+            </w:pPr>
+            <w:r>
+              <w:rPr>
+                <w:rFonts w:ascii="Times New Roman" w:hAnsi="Times New Roman"/>
+                <w:b w:val="0"/>
+                <w:sz w:val="15"/>
+              </w:rPr>
+              <w:t>SVR</w:t>
+            </w:r>
+          </w:p>
+        </w:tc>
+        <w:tc>
+          <w:tcPr>
+            <w:tcW w:type="dxa" w:w="600"/>
+            <w:tcMar>
+              <w:top w:type="dxa" w:w="60"/>
+              <w:left w:type="dxa" w:w="80"/>
+              <w:bottom w:type="dxa" w:w="60"/>
+              <w:right w:type="dxa" w:w="80"/>
+            </w:tcMar>
+            <w:vAlign w:val="center"/>
+          </w:tcPr>
+          <w:p>
+            <w:pPr>
+              <w:jc w:val="left"/>
+            </w:pPr>
+            <w:r>
+              <w:rPr>
+                <w:rFonts w:ascii="Times New Roman" w:hAnsi="Times New Roman"/>
+                <w:b w:val="0"/>
+                <w:sz w:val="15"/>
+              </w:rPr>
+              <w:t>3551.5</w:t>
+            </w:r>
+          </w:p>
+        </w:tc>
+        <w:tc>
+          <w:tcPr>
+            <w:tcW w:type="dxa" w:w="600"/>
+            <w:tcMar>
+              <w:top w:type="dxa" w:w="60"/>
+              <w:left w:type="dxa" w:w="80"/>
+              <w:bottom w:type="dxa" w:w="60"/>
+              <w:right w:type="dxa" w:w="80"/>
+            </w:tcMar>
+            <w:vAlign w:val="center"/>
+          </w:tcPr>
+          <w:p>
+            <w:pPr>
+              <w:jc w:val="left"/>
+            </w:pPr>
+            <w:r>
+              <w:rPr>
+                <w:rFonts w:ascii="Times New Roman" w:hAnsi="Times New Roman"/>
+                <w:b w:val="0"/>
+                <w:sz w:val="15"/>
+              </w:rPr>
+              <w:t>4732.8</w:t>
+            </w:r>
+          </w:p>
+        </w:tc>
+        <w:tc>
+          <w:tcPr>
+            <w:tcW w:type="dxa" w:w="750"/>
+            <w:tcMar>
+              <w:top w:type="dxa" w:w="60"/>
+              <w:left w:type="dxa" w:w="80"/>
+              <w:bottom w:type="dxa" w:w="60"/>
+              <w:right w:type="dxa" w:w="80"/>
+            </w:tcMar>
+            <w:vAlign w:val="center"/>
+          </w:tcPr>
+          <w:p>
+            <w:pPr>
+              <w:jc w:val="left"/>
+            </w:pPr>
+            <w:r>
+              <w:rPr>
+                <w:rFonts w:ascii="Times New Roman" w:hAnsi="Times New Roman"/>
+                <w:b w:val="0"/>
+                <w:sz w:val="15"/>
+              </w:rPr>
+              <w:t>0.567</w:t>
+            </w:r>
+          </w:p>
+        </w:tc>
+        <w:tc>
+          <w:tcPr>
+            <w:tcW w:type="dxa" w:w="850"/>
+            <w:tcMar>
+              <w:top w:type="dxa" w:w="60"/>
+              <w:left w:type="dxa" w:w="80"/>
+              <w:bottom w:type="dxa" w:w="60"/>
+              <w:right w:type="dxa" w:w="80"/>
+            </w:tcMar>
+            <w:vAlign w:val="center"/>
+          </w:tcPr>
+          <w:p>
+            <w:pPr>
+              <w:jc w:val="left"/>
+            </w:pPr>
+            <w:r>
+              <w:rPr>
+                <w:rFonts w:ascii="Times New Roman" w:hAnsi="Times New Roman"/>
+                <w:b w:val="0"/>
+                <w:sz w:val="15"/>
+              </w:rPr>
+              <w:t>12.5%</w:t>
+            </w:r>
+          </w:p>
+        </w:tc>
+      </w:tr>
+    </w:tbl>
+    <w:p>
+      <w:pPr>
+        <w:spacing w:after="120" w:line="252" w:lineRule="auto"/>
+        <w:jc w:val="both"/>
+      </w:pPr>
+      <w:r>
+        <w:rPr>
+          <w:rFonts w:ascii="Times New Roman" w:hAnsi="Times New Roman"/>
+          <w:sz w:val="20"/>
+        </w:rPr>
+        <w:t>This lines up with what Section II pointed toward. The 2023 study comparing Random Forest, Gradient Boosting, and Support Vector Regression on the same kind of effort estimation problem found Random Forest the most consistent of the three [3], and an ensemble method winning was exactly what this section predicted before any training happened. It is worth being equally honest about where the numbers fall short of the literature's higher-end claims: a PRED(25) of 42.1% on COCOMO-NASA and 25.0% on Desharnais are real improvements over Linear Regression, but both sit well under the 75% mark that effort estimation papers often treat as the bar for a genuinely reliable estimator, a gap that Section VII returns to.</w:t>
+      </w:r>
+    </w:p>
+    <w:p>
+      <w:pPr>
+        <w:spacing w:after="120" w:line="252" w:lineRule="auto"/>
+        <w:jc w:val="both"/>
+      </w:pPr>
+      <w:r>
+        <w:rPr>
+          <w:rFonts w:ascii="Times New Roman" w:hAnsi="Times New Roman"/>
+          <w:sz w:val="20"/>
+        </w:rPr>
+        <w:t>Explainability findings back this choice, too. On COCOMO-NASA, project size (equivphyskloc) and the runtime performance constraint together account for most of Random Forest's predictions, size doing the heavier lifting across the dataset as a whole while the runtime constraint dominates for individual high-constraint projects. On Desharnais, adjusted function points are the clear leading factor, with project duration and the unadjusted function point count following behind, a pattern consistent with the intuitive idea that bigger, longer-running systems cost more to build. Fig. 2 shows the ranked importance breakdown Random Forest produced for COCOMO-NASA.</w:t>
+      </w:r>
+    </w:p>
+    <w:p>
+      <w:pPr>
+        <w:jc w:val="center"/>
+      </w:pPr>
+      <w:r>
+        <w:drawing>
+          <wp:inline xmlns:a="http://schemas.openxmlformats.org/drawingml/2006/main" xmlns:pic="http://schemas.openxmlformats.org/drawingml/2006/picture">
+            <wp:extent cx="2926080" cy="2284781"/>
+            <wp:docPr id="2" name="Picture 2"/>
+            <wp:cNvGraphicFramePr>
+              <a:graphicFrameLocks noChangeAspect="1"/>
+            </wp:cNvGraphicFramePr>
+            <a:graphic>
+              <a:graphicData uri="http://schemas.openxmlformats.org/drawingml/2006/picture">
+                <pic:pic>
+                  <pic:nvPicPr>
+                    <pic:cNvPr id="0" name="feature_importance_cocomo_rf.png"/>
+                    <pic:cNvPicPr/>
+                  </pic:nvPicPr>
+                  <pic:blipFill>
+                    <a:blip r:embed="rId9"/>
+                    <a:stretch>
+                      <a:fillRect/>
+                    </a:stretch>
+                  </pic:blipFill>
+                  <pic:spPr>
+                    <a:xfrm>
+                      <a:off x="0" y="0"/>
+                      <a:ext cx="2926080" cy="2284781"/>
+                    </a:xfrm>
+                    <a:prstGeom prst="rect"/>
+                  </pic:spPr>
+                </pic:pic>
+              </a:graphicData>
+            </a:graphic>
+          </wp:inline>
+        </w:drawing>
+      </w:r>
+    </w:p>
+    <w:p>
+      <w:pPr>
+        <w:spacing w:after="160"/>
+        <w:jc w:val="center"/>
+      </w:pPr>
+      <w:r>
+        <w:rPr>
+          <w:rFonts w:ascii="Times New Roman" w:hAnsi="Times New Roman"/>
+          <w:i/>
+          <w:sz w:val="16"/>
+        </w:rPr>
+        <w:t>Fig. 2. Feature importance ranking for COCOMO-NASA (Random Forest).</w:t>
+      </w:r>
+    </w:p>
+    <w:p>
+      <w:pPr>
+        <w:spacing w:before="200" w:after="120"/>
+        <w:jc w:val="center"/>
+      </w:pPr>
+      <w:r>
+        <w:rPr>
+          <w:rFonts w:ascii="Times New Roman" w:hAnsi="Times New Roman"/>
+          <w:b/>
+          <w:sz w:val="20"/>
+        </w:rPr>
+        <w:t>VI. IMPLEMENTATION</w:t>
+      </w:r>
+    </w:p>
+    <w:p>
+      <w:pPr>
+        <w:spacing w:after="120" w:line="252" w:lineRule="auto"/>
+        <w:jc w:val="both"/>
+      </w:pPr>
+      <w:r>
+        <w:rPr>
+          <w:rFonts w:ascii="Times New Roman" w:hAnsi="Times New Roman"/>
+          <w:sz w:val="20"/>
+        </w:rPr>
+        <w:t>The trained models are served through a Flask web application rather than staying inside a notebook. A user picks a project domain, aerospace/embedded systems or business/information systems, which maps to the COCOMO-NASA or Desharnais model respectively, fills in a handful of project details such as size, complexity, reliability, and team experience, and submits the form. The application applies the exact same preprocessing fitted during training, runs the input through the corresponding Random Forest model, and returns a predicted effort and cost alongside a ranked, per-request breakdown of which factors drove that particular number, the same explainability mechanism described in Section III.E, rendered as a bar chart with a plain-language summary sentence rather than a raw table.</w:t>
       </w:r>
     </w:p>
     <w:p>
@@ -1479,7 +2997,7 @@
           <w:sz w:val="20"/>
           <w:szCs w:val="20"/>
         </w:rPr>
-        <w:t xml:space="preserve">VI. LIMITATIONS AND CHALLENGES</w:t>
+        <w:t>VII. LIMITATIONS AND CHALLENGES</w:t>
       </w:r>
     </w:p>
     <w:p>
@@ -1512,6 +3030,19 @@
     </w:p>
     <w:p>
       <w:pPr>
+        <w:spacing w:after="120" w:line="252" w:lineRule="auto"/>
+        <w:jc w:val="both"/>
+      </w:pPr>
+      <w:r>
+        <w:rPr>
+          <w:rFonts w:ascii="Times New Roman" w:hAnsi="Times New Roman"/>
+          <w:sz w:val="20"/>
+        </w:rPr>
+        <w:t>End-to-end testing turned up one more thing worth flagging: PRED(25) for the deployed Random Forest models, 42.1% on COCOMO-NASA and 25.0% on Desharnais, remains well short of the roughly 75% mark the effort estimation literature often uses as a threshold for a dependable estimator, so predictions should be read as a data-grounded starting point rather than a number to commit a budget to outright. Testing also confirmed that Random Forest's predictions stay bounded even for project sizes far outside the training data (five times the largest COCOMO-NASA project seen during training, for instance), which is reassuring, but a bounded prediction is not the same as an accurate one that far from what the model has actually seen, so extrapolated estimates deserve extra scrutiny.</w:t>
+      </w:r>
+    </w:p>
+    <w:p>
+      <w:pPr>
         <w:spacing w:after="120" w:before="200"/>
         <w:jc w:val="center"/>
       </w:pPr>
@@ -1523,7 +3054,7 @@
           <w:sz w:val="20"/>
           <w:szCs w:val="20"/>
         </w:rPr>
-        <w:t xml:space="preserve">VII. CONCLUSION AND FUTURE SCOPE</w:t>
+        <w:t>VIII. CONCLUSION AND FUTURE SCOPE</w:t>
       </w:r>
     </w:p>
     <w:p>
@@ -1537,7 +3068,7 @@
           <w:sz w:val="20"/>
           <w:szCs w:val="20"/>
         </w:rPr>
-        <w:t xml:space="preserve">What this paper lays out is EstimateX: a machine learning system meant to predict product development time and cost across multiple domains, and to explain its own predictions rather than hide behind a single number. The methodology is not invented from scratch, it builds on what prior work in this area has already found, and it runs on data that stays freely accessible rather than locked behind a paywall. What remains is the actual work, training the models described here, pulling in more domains beyond the two datasets used so far, and getting the planned web deployment far enough along that real users can test it instead of just a held-out slice of data.</w:t>
+        <w:t>What this paper lays out is EstimateX: a machine learning system meant to predict product development time and cost across multiple domains, and to explain its own predictions rather than hide behind a single number. The methodology is not invented from scratch, it builds on what prior work in this area has already found, and it runs on data that stays freely accessible rather than locked behind a paywall. That work is now complete: all four models were trained and evaluated on both datasets, Random Forest came out ahead on both, and a working Flask deployment lets a user get a real, explained estimate back rather than only a held-out slice of test data. What remains is pulling in more domains beyond the two datasets used here and building on the same explainability-first foundation as the system grows.</w:t>
       </w:r>
     </w:p>
     <w:p>

</xml_diff>